<commit_message>
rulebook groundwork: AI reads a rulebook, code quote-checks each rule; PDF paragraphs; citations checked
- extract_rulebook v1 prompt + schema; extraction/rulebook.py read_rulebook():
  one AI call, then every rule's quote is checked by code against its cited
  pieces; unverified rules kept with quoteChecked false; "Status: Proposed"
  in the cited text forces proposed. Fixture is hand-made (no key yet),
  marked _handmade; re-record with `npm run test:record -- --rulebook`.
- readers/pdf_document.py merges wrapped lines into paragraph pieces, so each
  rulebook rule is one piece (rulebook PDF: 171 -> 129 pieces).
- Rulebook "why" notes checked against eCFR / FDA / USC and corrected
  (101.7 vs FPLA for metric, 101.2(c)/101.7(h)(2), house rules flagged);
  build script tolerates line-wrap spaces; .docx/.pdf rebuilt.
</commit_message>
<xml_diff>
--- a/rulebooks/Dancing_Fish_US_Label_Rulebook.docx
+++ b/rulebooks/Dancing_Fish_US_Label_Rulebook.docx
@@ -375,7 +375,7 @@
         <w:rPr>
           <w:color w:val="555555"/>
         </w:rPr>
-        <w:t>Our reading of 21 CFR 101.3, which asks for the identity to be a principal feature of the front panel.</w:t>
+        <w:t>Built on 21 CFR 101.3(a), which asks for the identity to be a principal feature of the front panel, and 101.3(d), which asks for bold type in a size reasonably related to the most prominent print. "Largest text" is our stricter house test.</w:t>
       </w:r>
     </w:p>
     <w:p>
@@ -420,7 +420,7 @@
         <w:rPr>
           <w:color w:val="555555"/>
         </w:rPr>
-        <w:t>21 CFR 101.7 requires the net quantity on the principal display panel in both systems. The wording and the spacing are our house style.</w:t>
+        <w:t>21 CFR 101.7(a) and (f) require the net quantity on the principal display panel, in the bottom 30% of it. Metric as well as US units is required by the Fair Packaging and Labeling Act (15 U.S.C. 1453(a)(2)). The exact wording and the spacing are our house style.</w:t>
       </w:r>
     </w:p>
     <w:p>
@@ -473,7 +473,7 @@
         <w:rPr>
           <w:color w:val="555555"/>
         </w:rPr>
-        <w:t>21 CFR 101.5 allows the street address to be left out in some cases. We always print it, so customers and inspectors can reach us.</w:t>
+        <w:t>21 CFR 101.5(d) allows the street address to be left out when it is in a current city directory. We always print it, so customers and inspectors can reach us.</w:t>
       </w:r>
     </w:p>
     <w:p>
@@ -698,7 +698,7 @@
         <w:rPr>
           <w:color w:val="555555"/>
         </w:rPr>
-        <w:t>21 CFR 101.9 sets the daily values and the rounding rules. A wrong percentage is a labelling error even when the gram amount is right.</w:t>
+        <w:t>21 CFR 101.9(c)(8)(iv) and (c)(9) set the daily values, and 101.9(d)(7)(ii) sets the percent calculation, rounded to the nearest whole percent. A wrong percentage is a labelling error even when the gram amount is right.</w:t>
       </w:r>
     </w:p>
     <w:p>
@@ -796,7 +796,7 @@
         <w:rPr>
           <w:color w:val="555555"/>
         </w:rPr>
-        <w:t>Section 403(w) of the FD&amp;C Act (the Food Allergen Labeling and Consumer Protection Act), with sesame added by the FASTER Act. A "may contain" warning for a real ingredient understates the risk.</w:t>
+        <w:t>Section 403(w) of the FD&amp;C Act (21 U.S.C. 343(w), from the Food Allergen Labeling and Consumer Protection Act), with sesame added by the FASTER Act from 1 January 2023. The law lets a pack name the allergen in the ingredient list or in a "Contains" statement; requiring "Contains" is our house rule. A "may contain" warning for a real ingredient understates the risk.</w:t>
       </w:r>
     </w:p>
     <w:p>
@@ -849,7 +849,7 @@
         <w:rPr>
           <w:color w:val="555555"/>
         </w:rPr>
-        <w:t>Our reading of 21 CFR 101.60(c)(2).</w:t>
+        <w:t>Our reading of 21 CFR 101.60(c)(2), which bars added sugars and ingredients that contain them, such as concentrated fruit juice.</w:t>
       </w:r>
     </w:p>
     <w:p>
@@ -939,7 +939,7 @@
         <w:rPr>
           <w:color w:val="555555"/>
         </w:rPr>
-        <w:t>USDA National Organic Program, 7 CFR Part 205. The certificate is evidence the artwork cannot show.</w:t>
+        <w:t>USDA National Organic Program, 7 CFR Part 205 (labelling in 205.300 and 205.301). The certificate is evidence the artwork cannot show.</w:t>
       </w:r>
     </w:p>
     <w:p>
@@ -984,7 +984,7 @@
         <w:rPr>
           <w:color w:val="555555"/>
         </w:rPr>
-        <w:t>FDA guidance discourages "free" wording for genetic engineering because it is hard to prove. Version 3.1 replaced it with verified wording.</w:t>
+        <w:t>FDA's voluntary labeling guidance (November 2015, revised March 2019, non-binding) recommends against "free" wording for genetic engineering because it is hard to substantiate. Version 3.1 replaced it with verified wording.</w:t>
       </w:r>
     </w:p>
     <w:p>
@@ -1029,7 +1029,7 @@
         <w:rPr>
           <w:color w:val="555555"/>
         </w:rPr>
-        <w:t>"High" is a defined nutrient content claim for some nutrients (21 CFR 101.54(b)). With other words it can still read as one, so a person decides.</w:t>
+        <w:t>"High" is a defined nutrient content claim: 21 CFR 101.54(b) allows it only when the food has 20 percent or more of the daily value per reference amount customarily consumed. With other words it can still read as one, so a person decides.</w:t>
       </w:r>
     </w:p>
     <w:p>
@@ -1082,7 +1082,7 @@
         <w:rPr>
           <w:color w:val="555555"/>
         </w:rPr>
-        <w:t>House rule for readability. It does not replace the 1/16 inch lowercase height minimum in 21 CFR 101.2(c), which Regulatory checks on the printed proof.</w:t>
+        <w:t>House rule for readability. It does not replace the 1/16 inch minimum letter height in 21 CFR 101.2(c) (measured on the lowercase "o", see 101.7(h)(2)), which Regulatory checks on the printed proof.</w:t>
       </w:r>
     </w:p>
     <w:p>
@@ -1225,7 +1225,7 @@
         <w:rPr>
           <w:color w:val="555555"/>
         </w:rPr>
-        <w:t>Planning only. Do not apply until Regulatory issues version 4 of this rulebook.</w:t>
+        <w:t>Planning only (FDA proposed rule published 16 January 2025, Federal Register document 2025-00778; not yet final when checked). Do not apply until Regulatory issues version 4 of this rulebook.</w:t>
       </w:r>
     </w:p>
     <w:p>

</xml_diff>

<commit_message>
rulebook: DF-04 example follows 21 CFR 101.7(j) (1-4 lb packs: ounces, then pounds and ounces)
</commit_message>
<xml_diff>
--- a/rulebooks/Dancing_Fish_US_Label_Rulebook.docx
+++ b/rulebooks/Dancing_Fish_US_Label_Rulebook.docx
@@ -405,7 +405,7 @@
         <w:t xml:space="preserve">Rule: </w:t>
       </w:r>
       <w:r>
-        <w:t>The net quantity must appear on the front panel, in the bottom 30% of the panel, in both metric and US units, written as "NET WT 480 g (16.9 oz)" with a space between each number and its unit.</w:t>
+        <w:t>The net quantity must appear on the front panel, in the bottom 30% of the panel, in both metric and US units, written as "NET WT 16.9 OZ (1 LB 0.9 OZ) 480 g" with a space between each number and its unit.</w:t>
       </w:r>
     </w:p>
     <w:p>
@@ -420,7 +420,7 @@
         <w:rPr>
           <w:color w:val="555555"/>
         </w:rPr>
-        <w:t>21 CFR 101.7(a) and (f) require the net quantity on the principal display panel, in the bottom 30% of it. Metric as well as US units is required by the Fair Packaging and Labeling Act (15 U.S.C. 1453(a)(2)). The exact wording and the spacing are our house style.</w:t>
+        <w:t>21 CFR 101.7(a) and (f) require the net quantity on the principal display panel, in the bottom 30% of it. Metric as well as US units is required by the Fair Packaging and Labeling Act (15 U.S.C. 1453(a)(2)). A pack of 1 lb or more but under 4 lb states ounces, then pounds and ounces in brackets (101.7(j)). The exact wording and the spacing are our house style.</w:t>
       </w:r>
     </w:p>
     <w:p>

</xml_diff>